<commit_message>
fix bug notification download
</commit_message>
<xml_diff>
--- a/document_templates/Notifications/Notification-validated.docx
+++ b/document_templates/Notifications/Notification-validated.docx
@@ -14,8 +14,8 @@
           <w:lang w:val="en-US"/>
         </w:rPr>
       </w:pPr>
-      <w:bookmarkStart w:id="0" w:name="_Hlk71183188"/>
-      <w:bookmarkStart w:id="1" w:name="_Hlk66701854"/>
+      <w:bookmarkStart w:id="0" w:name="_Hlk66701854"/>
+      <w:bookmarkStart w:id="1" w:name="_Hlk71183188"/>
       <w:r>
         <w:rPr>
           <w:rFonts w:hint="default" w:ascii="Times New Roman" w:hAnsi="Times New Roman" w:cs="Times New Roman"/>
@@ -526,604 +526,698 @@
     </w:p>
     <w:p>
       <w:pPr>
+        <w:pStyle w:val="9"/>
+        <w:rPr>
+          <w:rFonts w:hint="default" w:ascii="Times New Roman" w:hAnsi="Times New Roman" w:cs="Times New Roman"/>
+          <w:sz w:val="19"/>
+          <w:szCs w:val="19"/>
+        </w:rPr>
+      </w:pPr>
+      <w:r>
+        <w:rPr>
+          <w:rFonts w:hint="default" w:ascii="Times New Roman" w:hAnsi="Times New Roman" w:cs="Times New Roman"/>
+          <w:sz w:val="19"/>
+          <w:szCs w:val="19"/>
+        </w:rPr>
+        <w:t>Montant</w:t>
+      </w:r>
+      <w:r>
+        <w:rPr>
+          <w:rFonts w:hint="default" w:ascii="Times New Roman" w:hAnsi="Times New Roman" w:cs="Times New Roman"/>
+          <w:sz w:val="19"/>
+          <w:szCs w:val="19"/>
+        </w:rPr>
+        <w:tab/>
+      </w:r>
+      <w:r>
+        <w:rPr>
+          <w:rFonts w:hint="default" w:ascii="Times New Roman" w:hAnsi="Times New Roman" w:cs="Times New Roman"/>
+          <w:sz w:val="19"/>
+          <w:szCs w:val="19"/>
+        </w:rPr>
+        <w:tab/>
+      </w:r>
+      <w:r>
+        <w:rPr>
+          <w:rFonts w:hint="default" w:ascii="Times New Roman" w:hAnsi="Times New Roman" w:cs="Times New Roman"/>
+          <w:sz w:val="19"/>
+          <w:szCs w:val="19"/>
+        </w:rPr>
+        <w:tab/>
+      </w:r>
+      <w:r>
+        <w:rPr>
+          <w:rFonts w:hint="default" w:ascii="Times New Roman" w:hAnsi="Times New Roman" w:cs="Times New Roman"/>
+          <w:sz w:val="19"/>
+          <w:szCs w:val="19"/>
+        </w:rPr>
+        <w:tab/>
+      </w:r>
+      <w:r>
+        <w:rPr>
+          <w:rFonts w:hint="default" w:ascii="Times New Roman" w:hAnsi="Times New Roman" w:cs="Times New Roman"/>
+          <w:sz w:val="19"/>
+          <w:szCs w:val="19"/>
+        </w:rPr>
+        <w:tab/>
+      </w:r>
+      <w:r>
+        <w:rPr>
+          <w:rFonts w:hint="default" w:cs="Times New Roman"/>
+          <w:sz w:val="19"/>
+          <w:szCs w:val="19"/>
+          <w:lang w:val="en-US"/>
+        </w:rPr>
+        <w:tab/>
+      </w:r>
+      <w:r>
+        <w:rPr>
+          <w:rFonts w:hint="default" w:ascii="Times New Roman" w:hAnsi="Times New Roman" w:cs="Times New Roman"/>
+          <w:sz w:val="19"/>
+          <w:szCs w:val="19"/>
+        </w:rPr>
+        <w:t>: ${</w:t>
+      </w:r>
+      <w:r>
+        <w:rPr>
+          <w:rFonts w:hint="default" w:cs="Times New Roman"/>
+          <w:sz w:val="19"/>
+          <w:szCs w:val="19"/>
+          <w:lang w:val="en-US"/>
+        </w:rPr>
+        <w:t>verbal_trial.</w:t>
+      </w:r>
+      <w:r>
+        <w:rPr>
+          <w:rFonts w:hint="default" w:ascii="Times New Roman" w:hAnsi="Times New Roman" w:cs="Times New Roman"/>
+          <w:sz w:val="19"/>
+          <w:szCs w:val="19"/>
+        </w:rPr>
+        <w:t xml:space="preserve">amount} FCFA </w:t>
+      </w:r>
+    </w:p>
+    <w:p>
+      <w:pPr>
+        <w:pStyle w:val="9"/>
+        <w:rPr>
+          <w:rFonts w:hint="default" w:ascii="Times New Roman" w:hAnsi="Times New Roman" w:cs="Times New Roman"/>
+          <w:sz w:val="19"/>
+          <w:szCs w:val="19"/>
+        </w:rPr>
+      </w:pPr>
+      <w:r>
+        <w:rPr>
+          <w:rFonts w:hint="default" w:ascii="Times New Roman" w:hAnsi="Times New Roman" w:cs="Times New Roman"/>
+          <w:sz w:val="19"/>
+          <w:szCs w:val="19"/>
+        </w:rPr>
+        <w:t>Durée</w:t>
+      </w:r>
+      <w:r>
+        <w:rPr>
+          <w:rFonts w:hint="default" w:ascii="Times New Roman" w:hAnsi="Times New Roman" w:cs="Times New Roman"/>
+          <w:sz w:val="19"/>
+          <w:szCs w:val="19"/>
+        </w:rPr>
+        <w:tab/>
+      </w:r>
+      <w:r>
+        <w:rPr>
+          <w:rFonts w:hint="default" w:ascii="Times New Roman" w:hAnsi="Times New Roman" w:cs="Times New Roman"/>
+          <w:sz w:val="19"/>
+          <w:szCs w:val="19"/>
+        </w:rPr>
+        <w:tab/>
+      </w:r>
+      <w:r>
+        <w:rPr>
+          <w:rFonts w:hint="default" w:ascii="Times New Roman" w:hAnsi="Times New Roman" w:cs="Times New Roman"/>
+          <w:sz w:val="19"/>
+          <w:szCs w:val="19"/>
+        </w:rPr>
+        <w:tab/>
+      </w:r>
+      <w:r>
+        <w:rPr>
+          <w:rFonts w:hint="default" w:ascii="Times New Roman" w:hAnsi="Times New Roman" w:cs="Times New Roman"/>
+          <w:sz w:val="19"/>
+          <w:szCs w:val="19"/>
+        </w:rPr>
+        <w:tab/>
+      </w:r>
+      <w:r>
+        <w:rPr>
+          <w:rFonts w:hint="default" w:ascii="Times New Roman" w:hAnsi="Times New Roman" w:cs="Times New Roman"/>
+          <w:sz w:val="19"/>
+          <w:szCs w:val="19"/>
+        </w:rPr>
+        <w:tab/>
+      </w:r>
+      <w:r>
+        <w:rPr>
+          <w:rFonts w:hint="default" w:ascii="Times New Roman" w:hAnsi="Times New Roman" w:cs="Times New Roman"/>
+          <w:sz w:val="19"/>
+          <w:szCs w:val="19"/>
+        </w:rPr>
+        <w:tab/>
+      </w:r>
+      <w:r>
+        <w:rPr>
+          <w:rFonts w:hint="default" w:ascii="Times New Roman" w:hAnsi="Times New Roman" w:cs="Times New Roman"/>
+          <w:sz w:val="19"/>
+          <w:szCs w:val="19"/>
+        </w:rPr>
+        <w:t>: ${</w:t>
+      </w:r>
+      <w:r>
+        <w:rPr>
+          <w:rFonts w:hint="default" w:cs="Times New Roman"/>
+          <w:sz w:val="19"/>
+          <w:szCs w:val="19"/>
+          <w:lang w:val="en-US"/>
+        </w:rPr>
+        <w:t>verbal_trial.</w:t>
+      </w:r>
+      <w:r>
+        <w:rPr>
+          <w:rFonts w:hint="default" w:ascii="Times New Roman" w:hAnsi="Times New Roman" w:cs="Times New Roman"/>
+          <w:sz w:val="19"/>
+          <w:szCs w:val="19"/>
+        </w:rPr>
+        <w:t xml:space="preserve">duration} mois   </w:t>
+      </w:r>
+    </w:p>
+    <w:p>
+      <w:pPr>
+        <w:pStyle w:val="9"/>
+        <w:rPr>
+          <w:rFonts w:hint="default" w:ascii="Times New Roman" w:hAnsi="Times New Roman" w:cs="Times New Roman"/>
+          <w:sz w:val="19"/>
+          <w:szCs w:val="19"/>
+        </w:rPr>
+      </w:pPr>
+      <w:r>
+        <w:rPr>
+          <w:rFonts w:hint="default" w:ascii="Times New Roman" w:hAnsi="Times New Roman" w:cs="Times New Roman"/>
+          <w:sz w:val="19"/>
+          <w:szCs w:val="19"/>
+        </w:rPr>
+        <w:t>Périodicité</w:t>
+      </w:r>
+      <w:r>
+        <w:rPr>
+          <w:rFonts w:hint="default" w:ascii="Times New Roman" w:hAnsi="Times New Roman" w:cs="Times New Roman"/>
+          <w:sz w:val="19"/>
+          <w:szCs w:val="19"/>
+        </w:rPr>
+        <w:tab/>
+      </w:r>
+      <w:r>
+        <w:rPr>
+          <w:rFonts w:hint="default" w:ascii="Times New Roman" w:hAnsi="Times New Roman" w:cs="Times New Roman"/>
+          <w:sz w:val="19"/>
+          <w:szCs w:val="19"/>
+        </w:rPr>
+        <w:tab/>
+      </w:r>
+      <w:r>
+        <w:rPr>
+          <w:rFonts w:hint="default" w:ascii="Times New Roman" w:hAnsi="Times New Roman" w:cs="Times New Roman"/>
+          <w:sz w:val="19"/>
+          <w:szCs w:val="19"/>
+        </w:rPr>
+        <w:tab/>
+      </w:r>
+      <w:r>
+        <w:rPr>
+          <w:rFonts w:hint="default" w:ascii="Times New Roman" w:hAnsi="Times New Roman" w:cs="Times New Roman"/>
+          <w:sz w:val="19"/>
+          <w:szCs w:val="19"/>
+        </w:rPr>
+        <w:tab/>
+      </w:r>
+      <w:r>
+        <w:rPr>
+          <w:rFonts w:hint="default" w:ascii="Times New Roman" w:hAnsi="Times New Roman" w:cs="Times New Roman"/>
+          <w:sz w:val="19"/>
+          <w:szCs w:val="19"/>
+        </w:rPr>
+        <w:tab/>
+      </w:r>
+      <w:r>
+        <w:rPr>
+          <w:rFonts w:hint="default" w:ascii="Times New Roman" w:hAnsi="Times New Roman" w:cs="Times New Roman"/>
+          <w:sz w:val="19"/>
+          <w:szCs w:val="19"/>
+        </w:rPr>
+        <w:t>: ${</w:t>
+      </w:r>
+      <w:r>
+        <w:rPr>
+          <w:rFonts w:hint="default" w:cs="Times New Roman"/>
+          <w:sz w:val="19"/>
+          <w:szCs w:val="19"/>
+          <w:lang w:val="en-US"/>
+        </w:rPr>
+        <w:t>verbal_trial.</w:t>
+      </w:r>
+      <w:r>
+        <w:rPr>
+          <w:rFonts w:hint="default" w:ascii="Times New Roman" w:hAnsi="Times New Roman" w:cs="Times New Roman"/>
+          <w:sz w:val="19"/>
+          <w:szCs w:val="19"/>
+        </w:rPr>
+        <w:t>periodicity.fr}</w:t>
+      </w:r>
+    </w:p>
+    <w:p>
+      <w:pPr>
+        <w:pStyle w:val="9"/>
+        <w:rPr>
+          <w:rFonts w:hint="default" w:ascii="Times New Roman" w:hAnsi="Times New Roman" w:cs="Times New Roman"/>
+          <w:sz w:val="19"/>
+          <w:szCs w:val="19"/>
+        </w:rPr>
+      </w:pPr>
+      <w:r>
+        <w:rPr>
+          <w:rFonts w:hint="default" w:ascii="Times New Roman" w:hAnsi="Times New Roman" w:cs="Times New Roman"/>
+          <w:sz w:val="19"/>
+          <w:szCs w:val="19"/>
+        </w:rPr>
+        <w:t>Taux d’Intérêt HT</w:t>
+      </w:r>
+      <w:r>
+        <w:rPr>
+          <w:rFonts w:hint="default" w:ascii="Times New Roman" w:hAnsi="Times New Roman" w:cs="Times New Roman"/>
+          <w:sz w:val="19"/>
+          <w:szCs w:val="19"/>
+        </w:rPr>
+        <w:tab/>
+      </w:r>
+      <w:r>
+        <w:rPr>
+          <w:rFonts w:hint="default" w:ascii="Times New Roman" w:hAnsi="Times New Roman" w:cs="Times New Roman"/>
+          <w:sz w:val="19"/>
+          <w:szCs w:val="19"/>
+        </w:rPr>
+        <w:tab/>
+      </w:r>
+      <w:r>
+        <w:rPr>
+          <w:rFonts w:hint="default" w:ascii="Times New Roman" w:hAnsi="Times New Roman" w:cs="Times New Roman"/>
+          <w:sz w:val="19"/>
+          <w:szCs w:val="19"/>
+        </w:rPr>
+        <w:tab/>
+      </w:r>
+      <w:r>
+        <w:rPr>
+          <w:rFonts w:hint="default" w:ascii="Times New Roman" w:hAnsi="Times New Roman" w:cs="Times New Roman"/>
+          <w:sz w:val="19"/>
+          <w:szCs w:val="19"/>
+        </w:rPr>
+        <w:tab/>
+      </w:r>
+      <w:r>
+        <w:rPr>
+          <w:rFonts w:hint="default" w:cs="Times New Roman"/>
+          <w:sz w:val="19"/>
+          <w:szCs w:val="19"/>
+          <w:lang w:val="en-US"/>
+        </w:rPr>
+        <w:tab/>
+      </w:r>
+      <w:r>
+        <w:rPr>
+          <w:rFonts w:hint="default" w:ascii="Times New Roman" w:hAnsi="Times New Roman" w:cs="Times New Roman"/>
+          <w:sz w:val="19"/>
+          <w:szCs w:val="19"/>
+        </w:rPr>
+        <w:t>: ${</w:t>
+      </w:r>
+      <w:r>
+        <w:rPr>
+          <w:rFonts w:hint="default" w:cs="Times New Roman"/>
+          <w:sz w:val="19"/>
+          <w:szCs w:val="19"/>
+          <w:lang w:val="en-US"/>
+        </w:rPr>
+        <w:t>verbal_trial.</w:t>
+      </w:r>
+      <w:r>
+        <w:rPr>
+          <w:rFonts w:hint="default" w:ascii="Times New Roman" w:hAnsi="Times New Roman" w:cs="Times New Roman"/>
+          <w:sz w:val="19"/>
+          <w:szCs w:val="19"/>
+        </w:rPr>
+        <w:t>tax_fee_interest_rate}%</w:t>
+      </w:r>
+    </w:p>
+    <w:p>
+      <w:pPr>
+        <w:pStyle w:val="9"/>
+        <w:rPr>
+          <w:rFonts w:hint="default" w:ascii="Times New Roman" w:hAnsi="Times New Roman" w:cs="Times New Roman"/>
+          <w:sz w:val="19"/>
+          <w:szCs w:val="19"/>
+        </w:rPr>
+      </w:pPr>
+      <w:r>
+        <w:rPr>
+          <w:rFonts w:hint="default" w:ascii="Times New Roman" w:hAnsi="Times New Roman" w:cs="Times New Roman"/>
+          <w:sz w:val="19"/>
+          <w:szCs w:val="19"/>
+        </w:rPr>
+        <w:t>TAF</w:t>
+      </w:r>
+      <w:r>
+        <w:rPr>
+          <w:rFonts w:hint="default" w:ascii="Times New Roman" w:hAnsi="Times New Roman" w:cs="Times New Roman"/>
+          <w:sz w:val="19"/>
+          <w:szCs w:val="19"/>
+        </w:rPr>
+        <w:tab/>
+      </w:r>
+      <w:r>
+        <w:rPr>
+          <w:rFonts w:hint="default" w:ascii="Times New Roman" w:hAnsi="Times New Roman" w:cs="Times New Roman"/>
+          <w:sz w:val="19"/>
+          <w:szCs w:val="19"/>
+        </w:rPr>
+        <w:tab/>
+      </w:r>
+      <w:r>
+        <w:rPr>
+          <w:rFonts w:hint="default" w:ascii="Times New Roman" w:hAnsi="Times New Roman" w:cs="Times New Roman"/>
+          <w:sz w:val="19"/>
+          <w:szCs w:val="19"/>
+        </w:rPr>
+        <w:tab/>
+      </w:r>
+      <w:r>
+        <w:rPr>
+          <w:rFonts w:hint="default" w:ascii="Times New Roman" w:hAnsi="Times New Roman" w:cs="Times New Roman"/>
+          <w:sz w:val="19"/>
+          <w:szCs w:val="19"/>
+        </w:rPr>
+        <w:tab/>
+      </w:r>
+      <w:r>
+        <w:rPr>
+          <w:rFonts w:hint="default" w:ascii="Times New Roman" w:hAnsi="Times New Roman" w:cs="Times New Roman"/>
+          <w:sz w:val="19"/>
+          <w:szCs w:val="19"/>
+        </w:rPr>
+        <w:tab/>
+      </w:r>
+      <w:r>
+        <w:rPr>
+          <w:rFonts w:hint="default" w:ascii="Times New Roman" w:hAnsi="Times New Roman" w:cs="Times New Roman"/>
+          <w:sz w:val="19"/>
+          <w:szCs w:val="19"/>
+        </w:rPr>
+        <w:tab/>
+      </w:r>
+      <w:r>
+        <w:rPr>
+          <w:rFonts w:hint="default" w:ascii="Times New Roman" w:hAnsi="Times New Roman" w:cs="Times New Roman"/>
+          <w:sz w:val="19"/>
+          <w:szCs w:val="19"/>
+        </w:rPr>
+        <w:t>: ${</w:t>
+      </w:r>
+      <w:r>
+        <w:rPr>
+          <w:rFonts w:hint="default" w:cs="Times New Roman"/>
+          <w:sz w:val="19"/>
+          <w:szCs w:val="19"/>
+          <w:lang w:val="en-US"/>
+        </w:rPr>
+        <w:t>verbal_trial.</w:t>
+      </w:r>
+      <w:r>
+        <w:rPr>
+          <w:rFonts w:hint="default" w:ascii="Times New Roman" w:hAnsi="Times New Roman" w:cs="Times New Roman"/>
+          <w:sz w:val="19"/>
+          <w:szCs w:val="19"/>
+        </w:rPr>
+        <w:t>taf}%</w:t>
+      </w:r>
+    </w:p>
+    <w:p>
+      <w:pPr>
+        <w:pStyle w:val="9"/>
+        <w:rPr>
+          <w:rFonts w:hint="default" w:ascii="Times New Roman" w:hAnsi="Times New Roman" w:cs="Times New Roman"/>
+          <w:sz w:val="19"/>
+          <w:szCs w:val="19"/>
+        </w:rPr>
+      </w:pPr>
+      <w:r>
+        <w:rPr>
+          <w:rFonts w:hint="default" w:ascii="Times New Roman" w:hAnsi="Times New Roman" w:cs="Times New Roman"/>
+          <w:sz w:val="19"/>
+          <w:szCs w:val="19"/>
+        </w:rPr>
+        <w:t>Frais de dossier Hors Taxe (${</w:t>
+      </w:r>
+      <w:r>
+        <w:rPr>
+          <w:rFonts w:hint="default" w:cs="Times New Roman"/>
+          <w:sz w:val="19"/>
+          <w:szCs w:val="19"/>
+          <w:lang w:val="en-US"/>
+        </w:rPr>
+        <w:t>verbal_trial.</w:t>
+      </w:r>
+      <w:r>
+        <w:rPr>
+          <w:rFonts w:hint="default" w:ascii="Times New Roman" w:hAnsi="Times New Roman" w:cs="Times New Roman"/>
+          <w:sz w:val="19"/>
+          <w:szCs w:val="19"/>
+        </w:rPr>
+        <w:t>administrative_fees_percentage}%)</w:t>
+      </w:r>
+      <w:r>
+        <w:rPr>
+          <w:rFonts w:hint="default" w:ascii="Times New Roman" w:hAnsi="Times New Roman" w:cs="Times New Roman"/>
+          <w:sz w:val="19"/>
+          <w:szCs w:val="19"/>
+        </w:rPr>
+        <w:tab/>
+      </w:r>
+      <w:r>
+        <w:rPr>
+          <w:rFonts w:hint="default" w:ascii="Times New Roman" w:hAnsi="Times New Roman" w:cs="Times New Roman"/>
+          <w:sz w:val="19"/>
+          <w:szCs w:val="19"/>
+        </w:rPr>
+        <w:tab/>
+      </w:r>
+      <w:r>
+        <w:rPr>
+          <w:rFonts w:hint="default" w:cs="Times New Roman"/>
+          <w:sz w:val="19"/>
+          <w:szCs w:val="19"/>
+          <w:lang w:val="en-US"/>
+        </w:rPr>
+        <w:tab/>
+      </w:r>
+      <w:r>
+        <w:rPr>
+          <w:rFonts w:hint="default" w:ascii="Times New Roman" w:hAnsi="Times New Roman" w:cs="Times New Roman"/>
+          <w:sz w:val="19"/>
+          <w:szCs w:val="19"/>
+        </w:rPr>
+        <w:t>: ${</w:t>
+      </w:r>
+      <w:r>
+        <w:rPr>
+          <w:rFonts w:hint="default" w:cs="Times New Roman"/>
+          <w:sz w:val="19"/>
+          <w:szCs w:val="19"/>
+          <w:lang w:val="en-US"/>
+        </w:rPr>
+        <w:t>verbal_trial.</w:t>
+      </w:r>
+      <w:r>
+        <w:rPr>
+          <w:rFonts w:hint="default" w:ascii="Times New Roman" w:hAnsi="Times New Roman" w:cs="Times New Roman"/>
+          <w:sz w:val="19"/>
+          <w:szCs w:val="19"/>
+        </w:rPr>
+        <w:t>administrative_fees_percentage.value} F CFA</w:t>
+      </w:r>
+    </w:p>
+    <w:p>
+      <w:pPr>
+        <w:pStyle w:val="9"/>
+        <w:rPr>
+          <w:rFonts w:hint="default" w:ascii="Times New Roman" w:hAnsi="Times New Roman" w:cs="Times New Roman"/>
+          <w:sz w:val="19"/>
+          <w:szCs w:val="19"/>
+        </w:rPr>
+      </w:pPr>
+      <w:r>
+        <w:rPr>
+          <w:rFonts w:hint="default" w:ascii="Times New Roman" w:hAnsi="Times New Roman" w:cs="Times New Roman"/>
+          <w:sz w:val="19"/>
+          <w:szCs w:val="19"/>
+        </w:rPr>
+        <w:t>Prime d’assurance</w:t>
+      </w:r>
+      <w:r>
+        <w:rPr>
+          <w:rFonts w:hint="default" w:ascii="Times New Roman" w:hAnsi="Times New Roman" w:cs="Times New Roman"/>
+          <w:sz w:val="19"/>
+          <w:szCs w:val="19"/>
+        </w:rPr>
+        <w:tab/>
+      </w:r>
+      <w:r>
+        <w:rPr>
+          <w:rFonts w:hint="default" w:ascii="Times New Roman" w:hAnsi="Times New Roman" w:cs="Times New Roman"/>
+          <w:sz w:val="19"/>
+          <w:szCs w:val="19"/>
+        </w:rPr>
+        <w:tab/>
+      </w:r>
+      <w:r>
+        <w:rPr>
+          <w:rFonts w:hint="default" w:ascii="Times New Roman" w:hAnsi="Times New Roman" w:cs="Times New Roman"/>
+          <w:sz w:val="19"/>
+          <w:szCs w:val="19"/>
+        </w:rPr>
+        <w:tab/>
+      </w:r>
+      <w:r>
+        <w:rPr>
+          <w:rFonts w:hint="default" w:ascii="Times New Roman" w:hAnsi="Times New Roman" w:cs="Times New Roman"/>
+          <w:sz w:val="19"/>
+          <w:szCs w:val="19"/>
+        </w:rPr>
+        <w:tab/>
+      </w:r>
+      <w:r>
+        <w:rPr>
+          <w:rFonts w:hint="default" w:cs="Times New Roman"/>
+          <w:sz w:val="19"/>
+          <w:szCs w:val="19"/>
+          <w:lang w:val="en-US"/>
+        </w:rPr>
+        <w:tab/>
+      </w:r>
+      <w:r>
+        <w:rPr>
+          <w:rFonts w:hint="default" w:ascii="Times New Roman" w:hAnsi="Times New Roman" w:cs="Times New Roman"/>
+          <w:sz w:val="19"/>
+          <w:szCs w:val="19"/>
+        </w:rPr>
+        <w:t>: selon la grille de l’assureur</w:t>
+      </w:r>
+    </w:p>
+    <w:p>
+      <w:pPr>
+        <w:pStyle w:val="9"/>
+        <w:rPr>
+          <w:rFonts w:hint="default" w:ascii="Times New Roman" w:hAnsi="Times New Roman" w:cs="Times New Roman"/>
+          <w:sz w:val="19"/>
+          <w:szCs w:val="19"/>
+        </w:rPr>
+      </w:pPr>
+      <w:r>
+        <w:rPr>
+          <w:rFonts w:hint="default" w:ascii="Times New Roman" w:hAnsi="Times New Roman" w:cs="Times New Roman"/>
+          <w:sz w:val="19"/>
+          <w:szCs w:val="19"/>
+        </w:rPr>
+        <w:t>${line_review_bonus}</w:t>
+      </w:r>
+    </w:p>
+    <w:p>
+      <w:pPr>
+        <w:pStyle w:val="9"/>
+        <w:rPr>
+          <w:rFonts w:hint="default" w:ascii="Times New Roman" w:hAnsi="Times New Roman" w:cs="Times New Roman"/>
+          <w:sz w:val="19"/>
+          <w:szCs w:val="19"/>
+        </w:rPr>
+      </w:pPr>
+      <w:bookmarkStart w:id="3" w:name="_GoBack"/>
+      <w:bookmarkEnd w:id="3"/>
+    </w:p>
+    <w:p>
+      <w:pPr>
+        <w:spacing w:after="0" w:line="240" w:lineRule="auto"/>
+        <w:ind w:right="57"/>
+        <w:jc w:val="both"/>
+        <w:rPr>
+          <w:rFonts w:hint="default" w:ascii="Times New Roman" w:hAnsi="Times New Roman" w:cs="Times New Roman"/>
+          <w:b/>
+          <w:sz w:val="19"/>
+          <w:szCs w:val="19"/>
+        </w:rPr>
+      </w:pPr>
+      <w:r>
+        <w:rPr>
+          <w:rFonts w:hint="default" w:ascii="Times New Roman" w:hAnsi="Times New Roman" w:cs="Times New Roman"/>
+          <w:b/>
+          <w:sz w:val="19"/>
+          <w:szCs w:val="19"/>
+          <w:u w:val="single"/>
+        </w:rPr>
+        <w:t>GARANTIES ET SUPPORTS RETENUS</w:t>
+      </w:r>
+      <w:r>
+        <w:rPr>
+          <w:rFonts w:hint="default" w:ascii="Times New Roman" w:hAnsi="Times New Roman" w:cs="Times New Roman"/>
+          <w:b/>
+          <w:sz w:val="19"/>
+          <w:szCs w:val="19"/>
+        </w:rPr>
+        <w:t> :</w:t>
+      </w:r>
+    </w:p>
+    <w:p>
+      <w:pPr>
+        <w:spacing w:after="0" w:line="240" w:lineRule="auto"/>
+        <w:ind w:right="57"/>
+        <w:jc w:val="both"/>
+        <w:rPr>
+          <w:rFonts w:hint="default" w:ascii="Times New Roman" w:hAnsi="Times New Roman" w:cs="Times New Roman"/>
+          <w:b/>
+          <w:sz w:val="19"/>
+          <w:szCs w:val="19"/>
+          <w:u w:val="single"/>
+        </w:rPr>
+      </w:pPr>
+    </w:p>
+    <w:p>
+      <w:pPr>
+        <w:spacing w:line="240" w:lineRule="auto"/>
+        <w:jc w:val="both"/>
+        <w:rPr>
+          <w:rFonts w:hint="default" w:ascii="Times New Roman" w:hAnsi="Times New Roman" w:cs="Times New Roman"/>
+          <w:sz w:val="24"/>
+          <w:szCs w:val="24"/>
+        </w:rPr>
+      </w:pPr>
+      <w:r>
+        <w:rPr>
+          <w:rFonts w:hint="default" w:ascii="Times New Roman" w:hAnsi="Times New Roman" w:cs="Times New Roman"/>
+          <w:sz w:val="24"/>
+          <w:szCs w:val="24"/>
+        </w:rPr>
+        <w:t>${guaranteeList}</w:t>
+      </w:r>
+    </w:p>
+    <w:p>
+      <w:pPr>
         <w:numPr>
           <w:ilvl w:val="0"/>
           <w:numId w:val="1"/>
         </w:numPr>
-        <w:spacing w:after="0" w:line="240" w:lineRule="auto"/>
-        <w:ind w:right="57"/>
-        <w:jc w:val="both"/>
-        <w:rPr>
-          <w:rFonts w:hint="default" w:ascii="Times New Roman" w:hAnsi="Times New Roman" w:cs="Times New Roman"/>
-          <w:sz w:val="19"/>
-          <w:szCs w:val="19"/>
-        </w:rPr>
-      </w:pPr>
-      <w:r>
-        <w:rPr>
-          <w:rFonts w:hint="default" w:ascii="Times New Roman" w:hAnsi="Times New Roman" w:cs="Times New Roman"/>
-          <w:sz w:val="19"/>
-          <w:szCs w:val="19"/>
-        </w:rPr>
-        <w:t>Montan</w:t>
-      </w:r>
-      <w:r>
-        <w:rPr>
-          <w:rFonts w:hint="default" w:ascii="Times New Roman" w:hAnsi="Times New Roman" w:cs="Times New Roman"/>
-          <w:sz w:val="19"/>
-          <w:szCs w:val="19"/>
-          <w:lang w:val="en-US"/>
-        </w:rPr>
-        <w:t>t</w:t>
-      </w:r>
-      <w:r>
-        <w:rPr>
-          <w:rFonts w:hint="default" w:ascii="Times New Roman" w:hAnsi="Times New Roman" w:cs="Times New Roman"/>
-          <w:sz w:val="19"/>
-          <w:szCs w:val="19"/>
-          <w:lang w:val="en-US"/>
-        </w:rPr>
-        <w:tab/>
-      </w:r>
-      <w:r>
-        <w:rPr>
-          <w:rFonts w:hint="default" w:ascii="Times New Roman" w:hAnsi="Times New Roman" w:cs="Times New Roman"/>
-          <w:sz w:val="19"/>
-          <w:szCs w:val="19"/>
-          <w:lang w:val="en-US"/>
-        </w:rPr>
-        <w:tab/>
-      </w:r>
-      <w:r>
-        <w:rPr>
-          <w:rFonts w:hint="default" w:ascii="Times New Roman" w:hAnsi="Times New Roman" w:cs="Times New Roman"/>
-          <w:sz w:val="19"/>
-          <w:szCs w:val="19"/>
-          <w:lang w:val="en-US"/>
-        </w:rPr>
-        <w:tab/>
-      </w:r>
-      <w:r>
-        <w:rPr>
-          <w:rFonts w:hint="default" w:ascii="Times New Roman" w:hAnsi="Times New Roman" w:cs="Times New Roman"/>
-          <w:sz w:val="19"/>
-          <w:szCs w:val="19"/>
-          <w:lang w:val="en-US"/>
-        </w:rPr>
-        <w:tab/>
-      </w:r>
-      <w:r>
-        <w:rPr>
-          <w:rFonts w:hint="default" w:ascii="Times New Roman" w:hAnsi="Times New Roman" w:cs="Times New Roman"/>
-          <w:sz w:val="19"/>
-          <w:szCs w:val="19"/>
-          <w:lang w:val="en-US"/>
-        </w:rPr>
-        <w:tab/>
-      </w:r>
-      <w:r>
-        <w:rPr>
-          <w:rFonts w:hint="default" w:ascii="Times New Roman" w:hAnsi="Times New Roman" w:cs="Times New Roman"/>
-          <w:sz w:val="19"/>
-          <w:szCs w:val="19"/>
-          <w:lang w:val="en-US"/>
-        </w:rPr>
-        <w:tab/>
-      </w:r>
-      <w:r>
-        <w:rPr>
-          <w:rFonts w:hint="default" w:ascii="Times New Roman" w:hAnsi="Times New Roman" w:cs="Times New Roman"/>
-          <w:sz w:val="19"/>
-          <w:szCs w:val="19"/>
-          <w:lang w:val="en-US"/>
-        </w:rPr>
-        <w:tab/>
-      </w:r>
-      <w:r>
-        <w:rPr>
-          <w:rFonts w:hint="default" w:ascii="Times New Roman" w:hAnsi="Times New Roman" w:cs="Times New Roman"/>
-          <w:sz w:val="19"/>
-          <w:szCs w:val="19"/>
-        </w:rPr>
-        <w:t xml:space="preserve">: </w:t>
-      </w:r>
-      <w:r>
-        <w:rPr>
-          <w:rFonts w:hint="default" w:ascii="Times New Roman" w:hAnsi="Times New Roman" w:cs="Times New Roman"/>
-          <w:sz w:val="19"/>
-          <w:szCs w:val="19"/>
-          <w:lang w:val="en-US"/>
-        </w:rPr>
-        <w:t>${verbal_trial.amount}</w:t>
-      </w:r>
-      <w:r>
-        <w:rPr>
-          <w:rFonts w:hint="default" w:ascii="Times New Roman" w:hAnsi="Times New Roman" w:cs="Times New Roman"/>
-          <w:sz w:val="19"/>
-          <w:szCs w:val="19"/>
-        </w:rPr>
-        <w:t xml:space="preserve"> F CFA</w:t>
-      </w:r>
-    </w:p>
-    <w:p>
-      <w:pPr>
-        <w:numPr>
-          <w:ilvl w:val="0"/>
-          <w:numId w:val="1"/>
-        </w:numPr>
-        <w:spacing w:after="0" w:line="240" w:lineRule="auto"/>
-        <w:ind w:right="57"/>
-        <w:jc w:val="both"/>
-        <w:rPr>
-          <w:rFonts w:hint="default" w:ascii="Times New Roman" w:hAnsi="Times New Roman" w:cs="Times New Roman"/>
-          <w:sz w:val="19"/>
-          <w:szCs w:val="19"/>
-        </w:rPr>
-      </w:pPr>
-      <w:r>
-        <w:rPr>
-          <w:rFonts w:hint="default" w:ascii="Times New Roman" w:hAnsi="Times New Roman" w:cs="Times New Roman"/>
-          <w:sz w:val="19"/>
-          <w:szCs w:val="19"/>
-        </w:rPr>
-        <w:t>Durée</w:t>
-      </w:r>
-      <w:r>
-        <w:rPr>
-          <w:rFonts w:hint="default" w:ascii="Times New Roman" w:hAnsi="Times New Roman" w:cs="Times New Roman"/>
-          <w:sz w:val="19"/>
-          <w:szCs w:val="19"/>
-          <w:lang w:val="en-US"/>
-        </w:rPr>
-        <w:tab/>
-      </w:r>
-      <w:r>
-        <w:rPr>
-          <w:rFonts w:hint="default" w:ascii="Times New Roman" w:hAnsi="Times New Roman" w:cs="Times New Roman"/>
-          <w:sz w:val="19"/>
-          <w:szCs w:val="19"/>
-          <w:lang w:val="en-US"/>
-        </w:rPr>
-        <w:tab/>
-      </w:r>
-      <w:r>
-        <w:rPr>
-          <w:rFonts w:hint="default" w:ascii="Times New Roman" w:hAnsi="Times New Roman" w:cs="Times New Roman"/>
-          <w:sz w:val="19"/>
-          <w:szCs w:val="19"/>
-          <w:lang w:val="en-US"/>
-        </w:rPr>
-        <w:tab/>
-      </w:r>
-      <w:r>
-        <w:rPr>
-          <w:rFonts w:hint="default" w:ascii="Times New Roman" w:hAnsi="Times New Roman" w:cs="Times New Roman"/>
-          <w:sz w:val="19"/>
-          <w:szCs w:val="19"/>
-          <w:lang w:val="en-US"/>
-        </w:rPr>
-        <w:tab/>
-      </w:r>
-      <w:r>
-        <w:rPr>
-          <w:rFonts w:hint="default" w:ascii="Times New Roman" w:hAnsi="Times New Roman" w:cs="Times New Roman"/>
-          <w:sz w:val="19"/>
-          <w:szCs w:val="19"/>
-          <w:lang w:val="en-US"/>
-        </w:rPr>
-        <w:tab/>
-      </w:r>
-      <w:r>
-        <w:rPr>
-          <w:rFonts w:hint="default" w:ascii="Times New Roman" w:hAnsi="Times New Roman" w:cs="Times New Roman"/>
-          <w:sz w:val="19"/>
-          <w:szCs w:val="19"/>
-          <w:lang w:val="en-US"/>
-        </w:rPr>
-        <w:tab/>
-      </w:r>
-      <w:r>
-        <w:rPr>
-          <w:rFonts w:hint="default" w:ascii="Times New Roman" w:hAnsi="Times New Roman" w:cs="Times New Roman"/>
-          <w:sz w:val="19"/>
-          <w:szCs w:val="19"/>
-          <w:lang w:val="en-US"/>
-        </w:rPr>
-        <w:tab/>
-      </w:r>
-      <w:r>
-        <w:rPr>
-          <w:rFonts w:hint="default" w:ascii="Times New Roman" w:hAnsi="Times New Roman" w:cs="Times New Roman"/>
-          <w:sz w:val="19"/>
-          <w:szCs w:val="19"/>
-        </w:rPr>
-        <w:t xml:space="preserve">: </w:t>
-      </w:r>
-      <w:r>
-        <w:rPr>
-          <w:rFonts w:hint="default" w:ascii="Times New Roman" w:hAnsi="Times New Roman" w:cs="Times New Roman"/>
-          <w:sz w:val="19"/>
-          <w:szCs w:val="19"/>
-          <w:lang w:val="en-US"/>
-        </w:rPr>
-        <w:t>${verbal_trial.duration}</w:t>
-      </w:r>
-      <w:r>
-        <w:rPr>
-          <w:rFonts w:hint="default" w:ascii="Times New Roman" w:hAnsi="Times New Roman" w:cs="Times New Roman"/>
-          <w:sz w:val="19"/>
-          <w:szCs w:val="19"/>
-        </w:rPr>
-        <w:t xml:space="preserve"> mois </w:t>
-      </w:r>
-    </w:p>
-    <w:p>
-      <w:pPr>
-        <w:numPr>
-          <w:ilvl w:val="0"/>
-          <w:numId w:val="1"/>
-        </w:numPr>
-        <w:spacing w:after="0" w:line="240" w:lineRule="auto"/>
-        <w:ind w:right="57"/>
-        <w:jc w:val="both"/>
-        <w:rPr>
-          <w:rFonts w:hint="default" w:ascii="Times New Roman" w:hAnsi="Times New Roman" w:cs="Times New Roman"/>
-          <w:sz w:val="19"/>
-          <w:szCs w:val="19"/>
-        </w:rPr>
-      </w:pPr>
-      <w:r>
-        <w:rPr>
-          <w:rFonts w:hint="default" w:ascii="Times New Roman" w:hAnsi="Times New Roman" w:cs="Times New Roman"/>
-          <w:sz w:val="19"/>
-          <w:szCs w:val="19"/>
-        </w:rPr>
-        <w:t xml:space="preserve">Périodicité                              </w:t>
-      </w:r>
-      <w:r>
-        <w:rPr>
-          <w:rFonts w:hint="default" w:ascii="Times New Roman" w:hAnsi="Times New Roman" w:cs="Times New Roman"/>
-          <w:sz w:val="19"/>
-          <w:szCs w:val="19"/>
-          <w:lang w:val="en-US"/>
-        </w:rPr>
-        <w:tab/>
-      </w:r>
-      <w:r>
-        <w:rPr>
-          <w:rFonts w:hint="default" w:ascii="Times New Roman" w:hAnsi="Times New Roman" w:cs="Times New Roman"/>
-          <w:sz w:val="19"/>
-          <w:szCs w:val="19"/>
-          <w:lang w:val="en-US"/>
-        </w:rPr>
-        <w:tab/>
-      </w:r>
-      <w:r>
-        <w:rPr>
-          <w:rFonts w:hint="default" w:ascii="Times New Roman" w:hAnsi="Times New Roman" w:cs="Times New Roman"/>
-          <w:sz w:val="19"/>
-          <w:szCs w:val="19"/>
-        </w:rPr>
-        <w:t xml:space="preserve">: </w:t>
-      </w:r>
-      <w:r>
-        <w:rPr>
-          <w:rFonts w:hint="default" w:ascii="Times New Roman" w:hAnsi="Times New Roman" w:cs="Times New Roman"/>
-          <w:sz w:val="19"/>
-          <w:szCs w:val="19"/>
-          <w:lang w:val="en-US"/>
-        </w:rPr>
-        <w:t>${verbal_trial.duration.fr}</w:t>
-      </w:r>
-    </w:p>
-    <w:p>
-      <w:pPr>
-        <w:numPr>
-          <w:ilvl w:val="0"/>
-          <w:numId w:val="1"/>
-        </w:numPr>
-        <w:spacing w:after="0" w:line="240" w:lineRule="auto"/>
-        <w:ind w:right="57"/>
-        <w:jc w:val="both"/>
-        <w:rPr>
-          <w:rFonts w:hint="default" w:ascii="Times New Roman" w:hAnsi="Times New Roman" w:cs="Times New Roman"/>
-          <w:sz w:val="19"/>
-          <w:szCs w:val="19"/>
-        </w:rPr>
-      </w:pPr>
-      <w:r>
-        <w:rPr>
-          <w:rFonts w:hint="default" w:ascii="Times New Roman" w:hAnsi="Times New Roman" w:cs="Times New Roman"/>
-          <w:sz w:val="19"/>
-          <w:szCs w:val="19"/>
-        </w:rPr>
-        <w:t xml:space="preserve">Taux d’Intérêt HT                                   </w:t>
-      </w:r>
-      <w:r>
-        <w:rPr>
-          <w:rFonts w:hint="default" w:ascii="Times New Roman" w:hAnsi="Times New Roman" w:cs="Times New Roman"/>
-          <w:sz w:val="19"/>
-          <w:szCs w:val="19"/>
-          <w:lang w:val="en-US"/>
-        </w:rPr>
-        <w:tab/>
-      </w:r>
-      <w:r>
-        <w:rPr>
-          <w:rFonts w:hint="default" w:ascii="Times New Roman" w:hAnsi="Times New Roman" w:cs="Times New Roman"/>
-          <w:sz w:val="19"/>
-          <w:szCs w:val="19"/>
-        </w:rPr>
-        <w:t xml:space="preserve">: </w:t>
-      </w:r>
-      <w:r>
-        <w:rPr>
-          <w:rFonts w:hint="default" w:ascii="Times New Roman" w:hAnsi="Times New Roman" w:cs="Times New Roman"/>
-          <w:sz w:val="19"/>
-          <w:szCs w:val="19"/>
-          <w:lang w:val="en-US"/>
-        </w:rPr>
-        <w:t>${verbal_trial.tax_fee_interest_rate}</w:t>
-      </w:r>
-      <w:r>
-        <w:rPr>
-          <w:rFonts w:hint="default" w:ascii="Times New Roman" w:hAnsi="Times New Roman" w:cs="Times New Roman"/>
-          <w:sz w:val="19"/>
-          <w:szCs w:val="19"/>
-        </w:rPr>
-        <w:t>%</w:t>
-      </w:r>
-    </w:p>
-    <w:p>
-      <w:pPr>
-        <w:numPr>
-          <w:ilvl w:val="0"/>
-          <w:numId w:val="1"/>
-        </w:numPr>
-        <w:spacing w:after="0" w:line="240" w:lineRule="auto"/>
-        <w:ind w:right="57"/>
-        <w:jc w:val="both"/>
-        <w:rPr>
-          <w:rFonts w:hint="default" w:ascii="Times New Roman" w:hAnsi="Times New Roman" w:cs="Times New Roman"/>
-          <w:sz w:val="19"/>
-          <w:szCs w:val="19"/>
-        </w:rPr>
-      </w:pPr>
-      <w:r>
-        <w:rPr>
-          <w:rFonts w:hint="default" w:ascii="Times New Roman" w:hAnsi="Times New Roman" w:cs="Times New Roman"/>
-          <w:sz w:val="19"/>
-          <w:szCs w:val="19"/>
-        </w:rPr>
-        <w:t xml:space="preserve">TAF                                               </w:t>
-      </w:r>
-      <w:r>
-        <w:rPr>
-          <w:rFonts w:hint="default" w:ascii="Times New Roman" w:hAnsi="Times New Roman" w:cs="Times New Roman"/>
-          <w:sz w:val="19"/>
-          <w:szCs w:val="19"/>
-          <w:lang w:val="en-US"/>
-        </w:rPr>
-        <w:tab/>
-      </w:r>
-      <w:r>
-        <w:rPr>
-          <w:rFonts w:hint="default" w:ascii="Times New Roman" w:hAnsi="Times New Roman" w:cs="Times New Roman"/>
-          <w:sz w:val="19"/>
-          <w:szCs w:val="19"/>
-        </w:rPr>
-        <w:t xml:space="preserve">: </w:t>
-      </w:r>
-      <w:r>
-        <w:rPr>
-          <w:rFonts w:hint="default" w:ascii="Times New Roman" w:hAnsi="Times New Roman" w:cs="Times New Roman"/>
-          <w:sz w:val="19"/>
-          <w:szCs w:val="19"/>
-          <w:lang w:val="en-US"/>
-        </w:rPr>
-        <w:t>${verbal_trial.taf}</w:t>
-      </w:r>
-      <w:r>
-        <w:rPr>
-          <w:rFonts w:hint="default" w:ascii="Times New Roman" w:hAnsi="Times New Roman" w:cs="Times New Roman"/>
-          <w:sz w:val="19"/>
-          <w:szCs w:val="19"/>
-        </w:rPr>
-        <w:t>%</w:t>
-      </w:r>
-    </w:p>
-    <w:p>
-      <w:pPr>
-        <w:numPr>
-          <w:ilvl w:val="0"/>
-          <w:numId w:val="1"/>
-        </w:numPr>
-        <w:spacing w:after="0" w:line="240" w:lineRule="auto"/>
-        <w:ind w:right="57"/>
-        <w:jc w:val="both"/>
-        <w:rPr>
-          <w:rFonts w:hint="default" w:ascii="Times New Roman" w:hAnsi="Times New Roman" w:cs="Times New Roman"/>
-          <w:sz w:val="19"/>
-          <w:szCs w:val="19"/>
-        </w:rPr>
-      </w:pPr>
-      <w:r>
-        <w:rPr>
-          <w:rFonts w:hint="default" w:ascii="Times New Roman" w:hAnsi="Times New Roman" w:cs="Times New Roman"/>
-          <w:sz w:val="19"/>
-          <w:szCs w:val="19"/>
-        </w:rPr>
-        <w:t>Frais de dossier</w:t>
-      </w:r>
-      <w:r>
-        <w:rPr>
-          <w:rFonts w:hint="default" w:ascii="Times New Roman" w:hAnsi="Times New Roman" w:cs="Times New Roman"/>
-          <w:sz w:val="19"/>
-          <w:szCs w:val="19"/>
-          <w:lang w:val="en-US"/>
-        </w:rPr>
-        <w:t xml:space="preserve"> Hors Taxe</w:t>
-      </w:r>
-      <w:r>
-        <w:rPr>
-          <w:rFonts w:hint="default" w:ascii="Times New Roman" w:hAnsi="Times New Roman" w:cs="Times New Roman"/>
-          <w:sz w:val="19"/>
-          <w:szCs w:val="19"/>
-        </w:rPr>
-        <w:t>(</w:t>
-      </w:r>
-      <w:r>
-        <w:rPr>
-          <w:rFonts w:hint="default" w:ascii="Times New Roman" w:hAnsi="Times New Roman" w:cs="Times New Roman"/>
-          <w:sz w:val="19"/>
-          <w:szCs w:val="19"/>
-          <w:lang w:val="en-US"/>
-        </w:rPr>
-        <w:t>${verbal_trial.administrative_fees_percentage}</w:t>
-      </w:r>
-      <w:r>
-        <w:rPr>
-          <w:rFonts w:hint="default" w:ascii="Times New Roman" w:hAnsi="Times New Roman" w:cs="Times New Roman"/>
-          <w:sz w:val="19"/>
-          <w:szCs w:val="19"/>
-        </w:rPr>
-        <w:t>%)</w:t>
-      </w:r>
-      <w:r>
-        <w:rPr>
-          <w:rFonts w:hint="default" w:ascii="Times New Roman" w:hAnsi="Times New Roman" w:cs="Times New Roman"/>
-          <w:sz w:val="19"/>
-          <w:szCs w:val="19"/>
-          <w:lang w:val="en-US"/>
-        </w:rPr>
-        <w:tab/>
-      </w:r>
-      <w:r>
-        <w:rPr>
-          <w:rFonts w:hint="default" w:ascii="Times New Roman" w:hAnsi="Times New Roman" w:cs="Times New Roman"/>
-          <w:sz w:val="19"/>
-          <w:szCs w:val="19"/>
-          <w:lang w:val="en-US"/>
-        </w:rPr>
-        <w:tab/>
-      </w:r>
-      <w:r>
-        <w:rPr>
-          <w:rFonts w:hint="default" w:ascii="Times New Roman" w:hAnsi="Times New Roman" w:cs="Times New Roman"/>
-          <w:sz w:val="19"/>
-          <w:szCs w:val="19"/>
-          <w:lang w:val="en-US"/>
-        </w:rPr>
-        <w:tab/>
-      </w:r>
-      <w:r>
-        <w:rPr>
-          <w:rFonts w:hint="default" w:ascii="Times New Roman" w:hAnsi="Times New Roman" w:cs="Times New Roman"/>
-          <w:sz w:val="19"/>
-          <w:szCs w:val="19"/>
-          <w:lang w:val="en-US"/>
-        </w:rPr>
-        <w:tab/>
-      </w:r>
-      <w:r>
-        <w:rPr>
-          <w:rFonts w:hint="default" w:ascii="Times New Roman" w:hAnsi="Times New Roman" w:cs="Times New Roman"/>
-          <w:sz w:val="19"/>
-          <w:szCs w:val="19"/>
-          <w:lang w:val="en-US"/>
-        </w:rPr>
-        <w:t>: ${verbal_trial.administrative_fees_percentage.value}</w:t>
-      </w:r>
-      <w:r>
-        <w:rPr>
-          <w:rFonts w:hint="default" w:ascii="Times New Roman" w:hAnsi="Times New Roman" w:cs="Times New Roman"/>
-          <w:sz w:val="19"/>
-          <w:szCs w:val="19"/>
-        </w:rPr>
-        <w:t xml:space="preserve"> F CFA</w:t>
-      </w:r>
-    </w:p>
-    <w:p>
-      <w:pPr>
-        <w:pStyle w:val="9"/>
-        <w:numPr>
-          <w:ilvl w:val="0"/>
-          <w:numId w:val="1"/>
-        </w:numPr>
-        <w:rPr>
-          <w:rFonts w:hint="default" w:ascii="Times New Roman" w:hAnsi="Times New Roman" w:cs="Times New Roman"/>
-          <w:sz w:val="19"/>
-          <w:szCs w:val="19"/>
-        </w:rPr>
-      </w:pPr>
-      <w:r>
-        <w:rPr>
-          <w:rFonts w:hint="default" w:ascii="Times New Roman" w:hAnsi="Times New Roman" w:cs="Times New Roman"/>
-          <w:sz w:val="19"/>
-          <w:szCs w:val="19"/>
-          <w:lang w:val="en-US"/>
-        </w:rPr>
-        <w:t>${line_review_bonus}</w:t>
-      </w:r>
-    </w:p>
-    <w:p>
-      <w:pPr>
-        <w:pStyle w:val="9"/>
-        <w:rPr>
-          <w:rFonts w:hint="default" w:ascii="Times New Roman" w:hAnsi="Times New Roman" w:cs="Times New Roman"/>
-          <w:sz w:val="19"/>
-          <w:szCs w:val="19"/>
-        </w:rPr>
-      </w:pPr>
-    </w:p>
-    <w:p>
-      <w:pPr>
-        <w:spacing w:after="0" w:line="240" w:lineRule="auto"/>
-        <w:ind w:right="57"/>
-        <w:jc w:val="both"/>
-        <w:rPr>
-          <w:rFonts w:hint="default" w:ascii="Times New Roman" w:hAnsi="Times New Roman" w:cs="Times New Roman"/>
-          <w:b/>
-          <w:sz w:val="19"/>
-          <w:szCs w:val="19"/>
-        </w:rPr>
-      </w:pPr>
-      <w:r>
-        <w:rPr>
-          <w:rFonts w:hint="default" w:ascii="Times New Roman" w:hAnsi="Times New Roman" w:cs="Times New Roman"/>
-          <w:b/>
-          <w:sz w:val="19"/>
-          <w:szCs w:val="19"/>
-          <w:u w:val="single"/>
-        </w:rPr>
-        <w:t>GARANTIES ET SUPPORTS RETENUS</w:t>
-      </w:r>
-      <w:r>
-        <w:rPr>
-          <w:rFonts w:hint="default" w:ascii="Times New Roman" w:hAnsi="Times New Roman" w:cs="Times New Roman"/>
-          <w:b/>
-          <w:sz w:val="19"/>
-          <w:szCs w:val="19"/>
-        </w:rPr>
-        <w:t> :</w:t>
-      </w:r>
-    </w:p>
-    <w:p>
-      <w:pPr>
-        <w:spacing w:after="0" w:line="240" w:lineRule="auto"/>
-        <w:ind w:right="57"/>
-        <w:jc w:val="both"/>
-        <w:rPr>
-          <w:rFonts w:hint="default" w:ascii="Times New Roman" w:hAnsi="Times New Roman" w:cs="Times New Roman"/>
-          <w:b/>
-          <w:sz w:val="19"/>
-          <w:szCs w:val="19"/>
-          <w:u w:val="single"/>
-        </w:rPr>
-      </w:pPr>
-    </w:p>
-    <w:p>
-      <w:pPr>
         <w:spacing w:line="240" w:lineRule="auto"/>
         <w:jc w:val="both"/>
         <w:rPr>
@@ -1138,33 +1232,8 @@
           <w:sz w:val="24"/>
           <w:szCs w:val="24"/>
         </w:rPr>
-        <w:t>${guaranteeList}</w:t>
-      </w:r>
-    </w:p>
-    <w:p>
-      <w:pPr>
-        <w:numPr>
-          <w:ilvl w:val="0"/>
-          <w:numId w:val="2"/>
-        </w:numPr>
-        <w:spacing w:line="240" w:lineRule="auto"/>
-        <w:jc w:val="both"/>
-        <w:rPr>
-          <w:rFonts w:hint="default" w:ascii="Times New Roman" w:hAnsi="Times New Roman" w:cs="Times New Roman"/>
-          <w:sz w:val="24"/>
-          <w:szCs w:val="24"/>
-        </w:rPr>
-      </w:pPr>
-      <w:r>
-        <w:rPr>
-          <w:rFonts w:hint="default" w:ascii="Times New Roman" w:hAnsi="Times New Roman" w:cs="Times New Roman"/>
-          <w:sz w:val="24"/>
-          <w:szCs w:val="24"/>
-        </w:rPr>
         <w:t>${type_of_guarantee.name}</w:t>
       </w:r>
-      <w:bookmarkStart w:id="3" w:name="_GoBack"/>
-      <w:bookmarkEnd w:id="3"/>
       <w:r>
         <w:rPr>
           <w:rFonts w:hint="default" w:ascii="Times New Roman" w:hAnsi="Times New Roman" w:cs="Times New Roman"/>
@@ -1905,6 +1974,12 @@
             <w:insideH w:val="single" w:color="auto" w:sz="4" w:space="0"/>
             <w:insideV w:val="single" w:color="auto" w:sz="4" w:space="0"/>
           </w:tblBorders>
+          <w:tblCellMar>
+            <w:top w:w="0" w:type="dxa"/>
+            <w:left w:w="108" w:type="dxa"/>
+            <w:bottom w:w="0" w:type="dxa"/>
+            <w:right w:w="108" w:type="dxa"/>
+          </w:tblCellMar>
         </w:tblPrEx>
         <w:tc>
           <w:tcPr>
@@ -2230,7 +2305,7 @@
         <w:pStyle w:val="9"/>
         <w:numPr>
           <w:ilvl w:val="0"/>
-          <w:numId w:val="3"/>
+          <w:numId w:val="2"/>
         </w:numPr>
         <w:jc w:val="both"/>
         <w:rPr>
@@ -2257,7 +2332,7 @@
         <w:pStyle w:val="9"/>
         <w:numPr>
           <w:ilvl w:val="0"/>
-          <w:numId w:val="3"/>
+          <w:numId w:val="2"/>
         </w:numPr>
         <w:jc w:val="both"/>
         <w:rPr>
@@ -2406,6 +2481,18 @@
                 <w:shd w:val="clear" w:fill="auto"/>
               </w:rPr>
             </w:pPr>
+            <w:r>
+              <w:rPr>
+                <w:rFonts w:hint="default" w:ascii="Times New Roman" w:hAnsi="Times New Roman" w:cs="Times New Roman"/>
+                <w:b w:val="0"/>
+                <w:bCs w:val="0"/>
+                <w:iCs/>
+                <w:sz w:val="24"/>
+                <w:szCs w:val="24"/>
+                <w:lang w:val="en-US"/>
+              </w:rPr>
+              <w:t>${head_credit_sign}</w:t>
+            </w:r>
           </w:p>
           <w:p>
             <w:pPr>
@@ -2425,57 +2512,6 @@
                 <w:lang w:val="en-US"/>
               </w:rPr>
             </w:pPr>
-            <w:r>
-              <w:rPr>
-                <w:rFonts w:hint="default" w:ascii="Times New Roman" w:hAnsi="Times New Roman" w:cs="Times New Roman"/>
-                <w:b/>
-                <w:bCs/>
-                <w:iCs/>
-                <w:color w:val="000000"/>
-                <w:sz w:val="22"/>
-                <w:szCs w:val="22"/>
-                <w:highlight w:val="none"/>
-                <w:shd w:val="clear" w:fill="auto"/>
-                <w:lang w:val="en-US"/>
-              </w:rPr>
-              <w:drawing>
-                <wp:inline distT="0" distB="0" distL="114300" distR="114300">
-                  <wp:extent cx="2170430" cy="2081530"/>
-                  <wp:effectExtent l="0" t="0" r="1270" b="13970"/>
-                  <wp:docPr id="4" name="Picture 4" descr="Signature"/>
-                  <wp:cNvGraphicFramePr>
-                    <a:graphicFrameLocks xmlns:a="http://schemas.openxmlformats.org/drawingml/2006/main" noChangeAspect="1"/>
-                  </wp:cNvGraphicFramePr>
-                  <a:graphic xmlns:a="http://schemas.openxmlformats.org/drawingml/2006/main">
-                    <a:graphicData uri="http://schemas.openxmlformats.org/drawingml/2006/picture">
-                      <pic:pic xmlns:pic="http://schemas.openxmlformats.org/drawingml/2006/picture">
-                        <pic:nvPicPr>
-                          <pic:cNvPr id="4" name="Picture 4" descr="Signature"/>
-                          <pic:cNvPicPr>
-                            <a:picLocks noChangeAspect="1"/>
-                          </pic:cNvPicPr>
-                        </pic:nvPicPr>
-                        <pic:blipFill>
-                          <a:blip r:embed="rId8"/>
-                          <a:stretch>
-                            <a:fillRect/>
-                          </a:stretch>
-                        </pic:blipFill>
-                        <pic:spPr>
-                          <a:xfrm>
-                            <a:off x="0" y="0"/>
-                            <a:ext cx="2170430" cy="2081530"/>
-                          </a:xfrm>
-                          <a:prstGeom prst="rect">
-                            <a:avLst/>
-                          </a:prstGeom>
-                        </pic:spPr>
-                      </pic:pic>
-                    </a:graphicData>
-                  </a:graphic>
-                </wp:inline>
-              </w:drawing>
-            </w:r>
           </w:p>
         </w:tc>
       </w:tr>
@@ -3000,126 +3036,10 @@
       </w:pPr>
     </w:lvl>
   </w:abstractNum>
-  <w:abstractNum w:abstractNumId="2">
-    <w:nsid w:val="70DC0791"/>
-    <w:multiLevelType w:val="multilevel"/>
-    <w:tmpl w:val="70DC0791"/>
-    <w:lvl w:ilvl="0" w:tentative="0">
-      <w:start w:val="1"/>
-      <w:numFmt w:val="bullet"/>
-      <w:lvlText w:val=""/>
-      <w:lvlJc w:val="left"/>
-      <w:pPr>
-        <w:ind w:left="720" w:hanging="360"/>
-      </w:pPr>
-      <w:rPr>
-        <w:rFonts w:hint="default" w:ascii="Symbol" w:hAnsi="Symbol"/>
-      </w:rPr>
-    </w:lvl>
-    <w:lvl w:ilvl="1" w:tentative="0">
-      <w:start w:val="1"/>
-      <w:numFmt w:val="bullet"/>
-      <w:lvlText w:val="o"/>
-      <w:lvlJc w:val="left"/>
-      <w:pPr>
-        <w:ind w:left="1440" w:hanging="360"/>
-      </w:pPr>
-      <w:rPr>
-        <w:rFonts w:hint="default" w:ascii="Courier New" w:hAnsi="Courier New" w:cs="Courier New"/>
-      </w:rPr>
-    </w:lvl>
-    <w:lvl w:ilvl="2" w:tentative="0">
-      <w:start w:val="1"/>
-      <w:numFmt w:val="bullet"/>
-      <w:lvlText w:val=""/>
-      <w:lvlJc w:val="left"/>
-      <w:pPr>
-        <w:ind w:left="2160" w:hanging="360"/>
-      </w:pPr>
-      <w:rPr>
-        <w:rFonts w:hint="default" w:ascii="Wingdings" w:hAnsi="Wingdings"/>
-      </w:rPr>
-    </w:lvl>
-    <w:lvl w:ilvl="3" w:tentative="0">
-      <w:start w:val="1"/>
-      <w:numFmt w:val="bullet"/>
-      <w:lvlText w:val=""/>
-      <w:lvlJc w:val="left"/>
-      <w:pPr>
-        <w:ind w:left="2880" w:hanging="360"/>
-      </w:pPr>
-      <w:rPr>
-        <w:rFonts w:hint="default" w:ascii="Symbol" w:hAnsi="Symbol"/>
-      </w:rPr>
-    </w:lvl>
-    <w:lvl w:ilvl="4" w:tentative="0">
-      <w:start w:val="1"/>
-      <w:numFmt w:val="bullet"/>
-      <w:lvlText w:val="o"/>
-      <w:lvlJc w:val="left"/>
-      <w:pPr>
-        <w:ind w:left="3600" w:hanging="360"/>
-      </w:pPr>
-      <w:rPr>
-        <w:rFonts w:hint="default" w:ascii="Courier New" w:hAnsi="Courier New" w:cs="Courier New"/>
-      </w:rPr>
-    </w:lvl>
-    <w:lvl w:ilvl="5" w:tentative="0">
-      <w:start w:val="1"/>
-      <w:numFmt w:val="bullet"/>
-      <w:lvlText w:val=""/>
-      <w:lvlJc w:val="left"/>
-      <w:pPr>
-        <w:ind w:left="4320" w:hanging="360"/>
-      </w:pPr>
-      <w:rPr>
-        <w:rFonts w:hint="default" w:ascii="Wingdings" w:hAnsi="Wingdings"/>
-      </w:rPr>
-    </w:lvl>
-    <w:lvl w:ilvl="6" w:tentative="0">
-      <w:start w:val="1"/>
-      <w:numFmt w:val="bullet"/>
-      <w:lvlText w:val=""/>
-      <w:lvlJc w:val="left"/>
-      <w:pPr>
-        <w:ind w:left="5040" w:hanging="360"/>
-      </w:pPr>
-      <w:rPr>
-        <w:rFonts w:hint="default" w:ascii="Symbol" w:hAnsi="Symbol"/>
-      </w:rPr>
-    </w:lvl>
-    <w:lvl w:ilvl="7" w:tentative="0">
-      <w:start w:val="1"/>
-      <w:numFmt w:val="bullet"/>
-      <w:lvlText w:val="o"/>
-      <w:lvlJc w:val="left"/>
-      <w:pPr>
-        <w:ind w:left="5760" w:hanging="360"/>
-      </w:pPr>
-      <w:rPr>
-        <w:rFonts w:hint="default" w:ascii="Courier New" w:hAnsi="Courier New" w:cs="Courier New"/>
-      </w:rPr>
-    </w:lvl>
-    <w:lvl w:ilvl="8" w:tentative="0">
-      <w:start w:val="1"/>
-      <w:numFmt w:val="bullet"/>
-      <w:lvlText w:val=""/>
-      <w:lvlJc w:val="left"/>
-      <w:pPr>
-        <w:ind w:left="6480" w:hanging="360"/>
-      </w:pPr>
-      <w:rPr>
-        <w:rFonts w:hint="default" w:ascii="Wingdings" w:hAnsi="Wingdings"/>
-      </w:rPr>
-    </w:lvl>
-  </w:abstractNum>
   <w:num w:numId="1">
-    <w:abstractNumId w:val="2"/>
+    <w:abstractNumId w:val="0"/>
   </w:num>
   <w:num w:numId="2">
-    <w:abstractNumId w:val="0"/>
-  </w:num>
-  <w:num w:numId="3">
     <w:abstractNumId w:val="1"/>
   </w:num>
 </w:numbering>

</xml_diff>